<commit_message>
Expediente con plazo extendido: protocolo actualizado, cartas de postulación y del asesor, bitácora del 26 oct
Protocolo con fecha de entrega, cronograma replanteado, visita técnica del 5 nov
(sin nombrar a la empresa), índice generado y tablas numeradas.

Co-Authored-By: Claude Opus 5.5 <noreply@anthropic.com>
Claude-Session: https://claude.ai/code/session_0196PzVRTZQBouewDYm2zLHc
</commit_message>
<xml_diff>
--- a/16-documentacion-final/formatos-llenos/F01_Inscripcion.docx
+++ b/16-documentacion-final/formatos-llenos/F01_Inscripcion.docx
@@ -1271,9 +1271,9 @@
     <w:basedOn w:val="Normal"/>
     <w:link w:val="BodyTextChar"/>
     <w:pPr>
-      <w:spacing w:after="0" w:before="0" w:line="240" w:lineRule="auto"/>
+      <w:spacing w:after="160" w:before="0" w:line="240" w:lineRule="auto"/>
       <w:ind w:firstLine="720"/>
-      <w:jc w:val="left"/>
+      <w:jc w:val="both"/>
     </w:pPr>
     <w:qFormat/>
     <w:rPr>
@@ -1287,9 +1287,9 @@
     <w:next w:val="BodyText"/>
     <w:qFormat/>
     <w:pPr>
-      <w:spacing w:after="0" w:before="0" w:line="240" w:lineRule="auto"/>
+      <w:spacing w:after="160" w:before="0" w:line="240" w:lineRule="auto"/>
       <w:ind w:firstLine="720"/>
-      <w:jc w:val="left"/>
+      <w:jc w:val="both"/>
     </w:pPr>
     <w:rPr>
       <w:rFonts w:ascii="Times New Roman" w:cs="Times New Roman" w:eastAsia="Times New Roman" w:hAnsi="Times New Roman"/>
@@ -1843,6 +1843,74 @@
       <w:spacing w:after="0" w:before="0" w:line="240" w:lineRule="auto"/>
       <w:ind w:firstLine="0"/>
       <w:jc w:val="center"/>
+    </w:pPr>
+    <w:rPr>
+      <w:rFonts w:ascii="Times New Roman" w:cs="Times New Roman" w:eastAsia="Times New Roman" w:hAnsi="Times New Roman"/>
+      <w:sz w:val="24"/>
+    </w:rPr>
+  </w:style>
+  <w:style w:customStyle="1" w:styleId="TableLabel" w:type="paragraph">
+    <w:name w:val="TableLabel"/>
+    <w:pPr>
+      <w:keepNext/>
+      <w:spacing w:after="0" w:before="240" w:line="240" w:lineRule="auto"/>
+      <w:ind w:firstLine="0"/>
+      <w:jc w:val="left"/>
+    </w:pPr>
+    <w:rPr>
+      <w:rFonts w:ascii="Times New Roman" w:cs="Times New Roman" w:eastAsia="Times New Roman" w:hAnsi="Times New Roman"/>
+      <w:b/>
+      <w:sz w:val="24"/>
+    </w:rPr>
+  </w:style>
+  <w:style w:customStyle="1" w:styleId="TableTitle" w:type="paragraph">
+    <w:name w:val="TableTitle"/>
+    <w:pPr>
+      <w:keepNext/>
+      <w:spacing w:after="120" w:before="0" w:line="240" w:lineRule="auto"/>
+      <w:ind w:firstLine="0"/>
+      <w:jc w:val="left"/>
+    </w:pPr>
+    <w:rPr>
+      <w:rFonts w:ascii="Times New Roman" w:cs="Times New Roman" w:eastAsia="Times New Roman" w:hAnsi="Times New Roman"/>
+      <w:b w:val="0"/>
+      <w:i/>
+      <w:sz w:val="24"/>
+    </w:rPr>
+  </w:style>
+  <w:style w:customStyle="1" w:styleId="TocEntry" w:type="paragraph">
+    <w:name w:val="TocEntry"/>
+    <w:pPr>
+      <w:tabs>
+        <w:tab w:leader="dot" w:pos="9360" w:val="right"/>
+      </w:tabs>
+      <w:spacing w:after="80" w:before="0" w:line="240" w:lineRule="auto"/>
+      <w:ind w:firstLine="0"/>
+      <w:jc w:val="left"/>
+    </w:pPr>
+    <w:rPr>
+      <w:rFonts w:ascii="Times New Roman" w:cs="Times New Roman" w:eastAsia="Times New Roman" w:hAnsi="Times New Roman"/>
+      <w:sz w:val="24"/>
+    </w:rPr>
+  </w:style>
+  <w:style w:customStyle="1" w:styleId="LetterRight" w:type="paragraph">
+    <w:name w:val="LetterRight"/>
+    <w:pPr>
+      <w:spacing w:after="240" w:before="0" w:line="240" w:lineRule="auto"/>
+      <w:ind w:firstLine="0"/>
+      <w:jc w:val="right"/>
+    </w:pPr>
+    <w:rPr>
+      <w:rFonts w:ascii="Times New Roman" w:cs="Times New Roman" w:eastAsia="Times New Roman" w:hAnsi="Times New Roman"/>
+      <w:sz w:val="24"/>
+    </w:rPr>
+  </w:style>
+  <w:style w:customStyle="1" w:styleId="LetterBlock" w:type="paragraph">
+    <w:name w:val="LetterBlock"/>
+    <w:pPr>
+      <w:spacing w:after="240" w:before="0" w:line="240" w:lineRule="auto"/>
+      <w:ind w:firstLine="0"/>
+      <w:jc w:val="left"/>
     </w:pPr>
     <w:rPr>
       <w:rFonts w:ascii="Times New Roman" w:cs="Times New Roman" w:eastAsia="Times New Roman" w:hAnsi="Times New Roman"/>

</xml_diff>

<commit_message>
Tercera integrante (D-012): actualizar protocolo, formatos, cartas y bitácora
Co-Authored-By: Claude Opus 5.5 <noreply@anthropic.com>
Claude-Session: https://claude.ai/code/session_0196PzVRTZQBouewDYm2zLHc
</commit_message>
<xml_diff>
--- a/16-documentacion-final/formatos-llenos/F01_Inscripcion.docx
+++ b/16-documentacion-final/formatos-llenos/F01_Inscripcion.docx
@@ -559,14 +559,14 @@
           <w:insideV w:val="nil"/>
         </w:tblBorders>
         <w:tblLayout w:type="fixed"/>
-        <w:tblW w:type="dxa" w:w="9357"/>
+        <w:tblW w:type="dxa" w:w="9360"/>
       </w:tblPr>
       <w:tblGrid>
-        <w:gridCol w:w="2090"/>
-        <w:gridCol w:w="2726"/>
-        <w:gridCol w:w="1453"/>
-        <w:gridCol w:w="1453"/>
-        <w:gridCol w:w="1635"/>
+        <w:gridCol w:w="2070"/>
+        <w:gridCol w:w="2790"/>
+        <w:gridCol w:w="1440"/>
+        <w:gridCol w:w="1440"/>
+        <w:gridCol w:w="1620"/>
       </w:tblGrid>
       <w:tr>
         <w:trPr>
@@ -575,7 +575,7 @@
         </w:trPr>
         <w:tc>
           <w:tcPr>
-            <w:tcW w:type="dxa" w:w="2090"/>
+            <w:tcW w:type="dxa" w:w="2070"/>
             <w:tcBorders>
               <w:bottom w:val="single" w:sz="6" w:color="000000"/>
             </w:tcBorders>
@@ -599,7 +599,7 @@
         </w:tc>
         <w:tc>
           <w:tcPr>
-            <w:tcW w:type="dxa" w:w="2726"/>
+            <w:tcW w:type="dxa" w:w="2790"/>
             <w:tcBorders>
               <w:bottom w:val="single" w:sz="6" w:color="000000"/>
             </w:tcBorders>
@@ -623,7 +623,7 @@
         </w:tc>
         <w:tc>
           <w:tcPr>
-            <w:tcW w:type="dxa" w:w="1453"/>
+            <w:tcW w:type="dxa" w:w="1440"/>
             <w:tcBorders>
               <w:bottom w:val="single" w:sz="6" w:color="000000"/>
             </w:tcBorders>
@@ -647,7 +647,7 @@
         </w:tc>
         <w:tc>
           <w:tcPr>
-            <w:tcW w:type="dxa" w:w="1453"/>
+            <w:tcW w:type="dxa" w:w="1440"/>
             <w:tcBorders>
               <w:bottom w:val="single" w:sz="6" w:color="000000"/>
             </w:tcBorders>
@@ -671,7 +671,7 @@
         </w:tc>
         <w:tc>
           <w:tcPr>
-            <w:tcW w:type="dxa" w:w="1635"/>
+            <w:tcW w:type="dxa" w:w="1620"/>
             <w:tcBorders>
               <w:bottom w:val="single" w:sz="6" w:color="000000"/>
             </w:tcBorders>
@@ -697,7 +697,7 @@
       <w:tr>
         <w:tc>
           <w:tcPr>
-            <w:tcW w:type="dxa" w:w="2090"/>
+            <w:tcW w:type="dxa" w:w="2070"/>
           </w:tcPr>
           <w:p>
             <w:pPr>
@@ -717,7 +717,7 @@
         </w:tc>
         <w:tc>
           <w:tcPr>
-            <w:tcW w:type="dxa" w:w="2726"/>
+            <w:tcW w:type="dxa" w:w="2790"/>
           </w:tcPr>
           <w:p>
             <w:pPr>
@@ -737,7 +737,7 @@
         </w:tc>
         <w:tc>
           <w:tcPr>
-            <w:tcW w:type="dxa" w:w="1453"/>
+            <w:tcW w:type="dxa" w:w="1440"/>
           </w:tcPr>
           <w:p>
             <w:pPr>
@@ -757,7 +757,7 @@
         </w:tc>
         <w:tc>
           <w:tcPr>
-            <w:tcW w:type="dxa" w:w="1453"/>
+            <w:tcW w:type="dxa" w:w="1440"/>
           </w:tcPr>
           <w:p>
             <w:pPr>
@@ -777,7 +777,7 @@
         </w:tc>
         <w:tc>
           <w:tcPr>
-            <w:tcW w:type="dxa" w:w="1635"/>
+            <w:tcW w:type="dxa" w:w="1620"/>
           </w:tcPr>
           <w:p>
             <w:pPr>
@@ -799,7 +799,7 @@
       <w:tr>
         <w:tc>
           <w:tcPr>
-            <w:tcW w:type="dxa" w:w="2090"/>
+            <w:tcW w:type="dxa" w:w="2070"/>
           </w:tcPr>
           <w:p>
             <w:pPr>
@@ -819,27 +819,27 @@
         </w:tc>
         <w:tc>
           <w:tcPr>
-            <w:tcW w:type="dxa" w:w="2726"/>
-          </w:tcPr>
-          <w:p>
-            <w:pPr>
-              <w:pStyle w:val="Compact"/>
-              <w:spacing w:line="240" w:lineRule="auto" w:after="40"/>
-              <w:ind w:firstLine="0"/>
-              <w:jc w:val="left"/>
-            </w:pPr>
-            <w:r>
-              <w:rPr>
-                <w:rFonts w:ascii="Times New Roman" w:hAnsi="Times New Roman"/>
-                <w:sz w:val="20"/>
-              </w:rPr>
-              <w:t xml:space="preserve">Israel Jesus Garcia Osorio</w:t>
-            </w:r>
-          </w:p>
-        </w:tc>
-        <w:tc>
-          <w:tcPr>
-            <w:tcW w:type="dxa" w:w="1453"/>
+            <w:tcW w:type="dxa" w:w="2790"/>
+          </w:tcPr>
+          <w:p>
+            <w:pPr>
+              <w:pStyle w:val="Compact"/>
+              <w:spacing w:line="240" w:lineRule="auto" w:after="40"/>
+              <w:ind w:firstLine="0"/>
+              <w:jc w:val="left"/>
+            </w:pPr>
+            <w:r>
+              <w:rPr>
+                <w:rFonts w:ascii="Times New Roman" w:hAnsi="Times New Roman"/>
+                <w:sz w:val="20"/>
+              </w:rPr>
+              <w:t xml:space="preserve">Israel Jesús García Osorio</w:t>
+            </w:r>
+          </w:p>
+        </w:tc>
+        <w:tc>
+          <w:tcPr>
+            <w:tcW w:type="dxa" w:w="1440"/>
           </w:tcPr>
           <w:p>
             <w:pPr>
@@ -859,7 +859,7 @@
         </w:tc>
         <w:tc>
           <w:tcPr>
-            <w:tcW w:type="dxa" w:w="1453"/>
+            <w:tcW w:type="dxa" w:w="1440"/>
           </w:tcPr>
           <w:p>
             <w:pPr>
@@ -879,7 +879,7 @@
         </w:tc>
         <w:tc>
           <w:tcPr>
-            <w:tcW w:type="dxa" w:w="1635"/>
+            <w:tcW w:type="dxa" w:w="1620"/>
           </w:tcPr>
           <w:p>
             <w:pPr>
@@ -901,7 +901,7 @@
       <w:tr>
         <w:tc>
           <w:tcPr>
-            <w:tcW w:type="dxa" w:w="2090"/>
+            <w:tcW w:type="dxa" w:w="2070"/>
           </w:tcPr>
           <w:p>
             <w:pPr>
@@ -921,68 +921,89 @@
         </w:tc>
         <w:tc>
           <w:tcPr>
-            <w:tcW w:type="dxa" w:w="2726"/>
-          </w:tcPr>
-          <w:p>
-            <w:pPr>
-              <w:pStyle w:val="Compact"/>
-              <w:spacing w:line="240" w:lineRule="auto" w:after="40"/>
-              <w:ind w:firstLine="0"/>
-              <w:jc w:val="left"/>
-            </w:pPr>
-            <w:r>
-              <w:rPr>
-                <w:rFonts w:ascii="Times New Roman" w:hAnsi="Times New Roman"/>
-                <w:sz w:val="20"/>
-              </w:rPr>
-              <w:t xml:space="preserve">No aplica</w:t>
-            </w:r>
-          </w:p>
-        </w:tc>
-        <w:tc>
-          <w:tcPr>
-            <w:tcW w:type="dxa" w:w="1453"/>
-          </w:tcPr>
-          <w:p>
-            <w:pPr>
-              <w:pStyle w:val="Compact"/>
-              <w:spacing w:line="240" w:lineRule="auto" w:after="40"/>
-              <w:ind w:firstLine="0"/>
-              <w:jc w:val="left"/>
-            </w:pPr>
-          </w:p>
-        </w:tc>
-        <w:tc>
-          <w:tcPr>
-            <w:tcW w:type="dxa" w:w="1453"/>
-          </w:tcPr>
-          <w:p>
-            <w:pPr>
-              <w:pStyle w:val="Compact"/>
-              <w:spacing w:line="240" w:lineRule="auto" w:after="40"/>
-              <w:ind w:firstLine="0"/>
-              <w:jc w:val="left"/>
-            </w:pPr>
-          </w:p>
-        </w:tc>
-        <w:tc>
-          <w:tcPr>
-            <w:tcW w:type="dxa" w:w="1635"/>
-          </w:tcPr>
-          <w:p>
-            <w:pPr>
-              <w:pStyle w:val="Compact"/>
-              <w:spacing w:line="240" w:lineRule="auto" w:after="40"/>
-              <w:ind w:firstLine="0"/>
-              <w:jc w:val="left"/>
-            </w:pPr>
+            <w:tcW w:type="dxa" w:w="2790"/>
+          </w:tcPr>
+          <w:p>
+            <w:pPr>
+              <w:pStyle w:val="Compact"/>
+              <w:spacing w:line="240" w:lineRule="auto" w:after="40"/>
+              <w:ind w:firstLine="0"/>
+              <w:jc w:val="left"/>
+            </w:pPr>
+            <w:r>
+              <w:rPr>
+                <w:rFonts w:ascii="Times New Roman" w:hAnsi="Times New Roman"/>
+                <w:sz w:val="20"/>
+              </w:rPr>
+              <w:t xml:space="preserve">María José de la Rosa Hernández</w:t>
+            </w:r>
+          </w:p>
+        </w:tc>
+        <w:tc>
+          <w:tcPr>
+            <w:tcW w:type="dxa" w:w="1440"/>
+          </w:tcPr>
+          <w:p>
+            <w:pPr>
+              <w:pStyle w:val="Compact"/>
+              <w:spacing w:line="240" w:lineRule="auto" w:after="40"/>
+              <w:ind w:firstLine="0"/>
+              <w:jc w:val="left"/>
+            </w:pPr>
+            <w:r>
+              <w:rPr>
+                <w:rFonts w:ascii="Times New Roman" w:hAnsi="Times New Roman"/>
+                <w:sz w:val="20"/>
+              </w:rPr>
+              <w:t xml:space="preserve">________________</w:t>
+            </w:r>
+          </w:p>
+        </w:tc>
+        <w:tc>
+          <w:tcPr>
+            <w:tcW w:type="dxa" w:w="1440"/>
+          </w:tcPr>
+          <w:p>
+            <w:pPr>
+              <w:pStyle w:val="Compact"/>
+              <w:spacing w:line="240" w:lineRule="auto" w:after="40"/>
+              <w:ind w:firstLine="0"/>
+              <w:jc w:val="left"/>
+            </w:pPr>
+            <w:r>
+              <w:rPr>
+                <w:rFonts w:ascii="Times New Roman" w:hAnsi="Times New Roman"/>
+                <w:sz w:val="20"/>
+              </w:rPr>
+              <w:t xml:space="preserve">________________</w:t>
+            </w:r>
+          </w:p>
+        </w:tc>
+        <w:tc>
+          <w:tcPr>
+            <w:tcW w:type="dxa" w:w="1620"/>
+          </w:tcPr>
+          <w:p>
+            <w:pPr>
+              <w:pStyle w:val="Compact"/>
+              <w:spacing w:line="240" w:lineRule="auto" w:after="40"/>
+              <w:ind w:firstLine="0"/>
+              <w:jc w:val="left"/>
+            </w:pPr>
+            <w:r>
+              <w:rPr>
+                <w:rFonts w:ascii="Times New Roman" w:hAnsi="Times New Roman"/>
+                <w:sz w:val="20"/>
+              </w:rPr>
+              <w:t xml:space="preserve">________________</w:t>
+            </w:r>
           </w:p>
         </w:tc>
       </w:tr>
       <w:tr>
         <w:tc>
           <w:tcPr>
-            <w:tcW w:type="dxa" w:w="2090"/>
+            <w:tcW w:type="dxa" w:w="2070"/>
           </w:tcPr>
           <w:p>
             <w:pPr>
@@ -1002,7 +1023,7 @@
         </w:tc>
         <w:tc>
           <w:tcPr>
-            <w:tcW w:type="dxa" w:w="2726"/>
+            <w:tcW w:type="dxa" w:w="2790"/>
           </w:tcPr>
           <w:p>
             <w:pPr>
@@ -1022,7 +1043,7 @@
         </w:tc>
         <w:tc>
           <w:tcPr>
-            <w:tcW w:type="dxa" w:w="1453"/>
+            <w:tcW w:type="dxa" w:w="1440"/>
           </w:tcPr>
           <w:p>
             <w:pPr>
@@ -1042,7 +1063,7 @@
         </w:tc>
         <w:tc>
           <w:tcPr>
-            <w:tcW w:type="dxa" w:w="1453"/>
+            <w:tcW w:type="dxa" w:w="1440"/>
           </w:tcPr>
           <w:p>
             <w:pPr>
@@ -1062,7 +1083,7 @@
         </w:tc>
         <w:tc>
           <w:tcPr>
-            <w:tcW w:type="dxa" w:w="1635"/>
+            <w:tcW w:type="dxa" w:w="1620"/>
           </w:tcPr>
           <w:p>
             <w:pPr>

</xml_diff>